<commit_message>
Merge open points and next steps
</commit_message>
<xml_diff>
--- a/docs/rollout-konzept/einfuehrungskonzept_ila_grundschulen_hessen.docx
+++ b/docs/rollout-konzept/einfuehrungskonzept_ila_grundschulen_hessen.docx
@@ -771,7 +771,7 @@
         <w:pStyle w:val="Heading2"/>
       </w:pPr>
       <w:r>
-        <w:t>12. Offene Punkte</w:t>
+        <w:t>12. Offene Punkte und nächste Schritte</w:t>
       </w:r>
     </w:p>
     <w:p>
@@ -779,7 +779,7 @@
         <w:pStyle w:val="ListBullet"/>
       </w:pPr>
       <w:r>
-        <w:t>genaue Ausgestaltung des 1st Level Supports jenseits der Schul-ID-bezogenen Anmeldung</w:t>
+        <w:t>genaue Ausgestaltung des 1st Level Supports jenseits der Schul-ID-bezogenen Anmeldung klären</w:t>
       </w:r>
     </w:p>
     <w:p>
@@ -787,7 +787,7 @@
         <w:pStyle w:val="ListBullet"/>
       </w:pPr>
       <w:r>
-        <w:t>Klärung der Routingwege zwischen HZD, Projektteam und technischer Bearbeitung</w:t>
+        <w:t>Routingwege zwischen HZD, Projektteam und technischer Bearbeitung abstimmen</w:t>
       </w:r>
     </w:p>
     <w:p>
@@ -795,7 +795,7 @@
         <w:pStyle w:val="ListBullet"/>
       </w:pPr>
       <w:r>
-        <w:t>konkrete Ausgestaltung der Kommunikationskanäle für die Schulen</w:t>
+        <w:t>Kommunikationskanäle für die Schulen konkret festlegen</w:t>
       </w:r>
     </w:p>
     <w:p>
@@ -803,7 +803,7 @@
         <w:pStyle w:val="ListBullet"/>
       </w:pPr>
       <w:r>
-        <w:t>Umfang und Form der Befähigungsangebote für die Nutzergruppen</w:t>
+        <w:t>Umfang und Form der Befähigungsangebote für die Nutzergruppen definieren</w:t>
       </w:r>
     </w:p>
     <w:p>
@@ -811,16 +811,7 @@
         <w:pStyle w:val="ListBullet"/>
       </w:pPr>
       <w:r>
-        <w:t>Weiterentwicklung der integrierten Feedbackfunktion</w:t>
-      </w:r>
-    </w:p>
-    <w:p/>
-    <w:p>
-      <w:pPr>
-        <w:pStyle w:val="Heading2"/>
-      </w:pPr>
-      <w:r>
-        <w:t>13. Nächste Schritte</w:t>
+        <w:t>integrierte Feedbackfunktion weiterentwickeln und Rückmeldewege festlegen</w:t>
       </w:r>
     </w:p>
     <w:p>
@@ -828,7 +819,7 @@
         <w:pStyle w:val="ListBullet"/>
       </w:pPr>
       <w:r>
-        <w:t>offene technische und organisatorische Voraussetzungen klären</w:t>
+        <w:t>offene technische und organisatorische Voraussetzungen priorisieren und abschließend bewerten</w:t>
       </w:r>
     </w:p>
     <w:p>
@@ -836,7 +827,7 @@
         <w:pStyle w:val="ListBullet"/>
       </w:pPr>
       <w:r>
-        <w:t>Kommunikationsmaßnahmen konkretisieren und terminieren</w:t>
+        <w:t>Kommunikationsmaßnahmen konkretisieren, terminieren und vorbereiten</w:t>
       </w:r>
     </w:p>
     <w:p>
@@ -845,14 +836,6 @@
       </w:pPr>
       <w:r>
         <w:t>Supportstruktur einschließlich Zuständigkeiten und Routing final abstimmen</w:t>
-      </w:r>
-    </w:p>
-    <w:p>
-      <w:pPr>
-        <w:pStyle w:val="ListBullet"/>
-      </w:pPr>
-      <w:r>
-        <w:t>Feedback- und Rückmeldewege festlegen</w:t>
       </w:r>
     </w:p>
     <w:p>

</xml_diff>

<commit_message>
Merge risks and mitigation section
</commit_message>
<xml_diff>
--- a/docs/rollout-konzept/einfuehrungskonzept_ila_grundschulen_hessen.docx
+++ b/docs/rollout-konzept/einfuehrungskonzept_ila_grundschulen_hessen.docx
@@ -640,7 +640,7 @@
         <w:pStyle w:val="Heading2"/>
       </w:pPr>
       <w:r>
-        <w:t>9. Bekannte Abhängigkeiten und Risiken</w:t>
+        <w:t>9. Risiken, Abhängigkeiten und Maßnahmen zur Absicherung</w:t>
       </w:r>
     </w:p>
     <w:p>
@@ -648,7 +648,7 @@
         <w:pStyle w:val="ListBullet"/>
       </w:pPr>
       <w:r>
-        <w:t>teilweise Einschränkungen bzw. Nichtverfügbarkeit einzelner technischer oder organisatorischer Voraussetzungen</w:t>
+        <w:t>einzelne technische oder organisatorische Voraussetzungen stehen möglicherweise nicht rechtzeitig oder nicht vollständig zur Verfügung; offene Punkte müssen deshalb vor dem Livegang transparent benannt und priorisiert werden</w:t>
       </w:r>
     </w:p>
     <w:p>
@@ -656,7 +656,7 @@
         <w:pStyle w:val="ListBullet"/>
       </w:pPr>
       <w:r>
-        <w:t>Abhängigkeiten zu angebundenen Komponenten und beteiligten Stellen</w:t>
+        <w:t>der Rollout ist von angebundenen Komponenten und beteiligten Stellen abhängig; daraus resultierende Abhängigkeiten müssen frühzeitig geklärt und eng begleitet werden</w:t>
       </w:r>
     </w:p>
     <w:p>
@@ -664,7 +664,7 @@
         <w:pStyle w:val="ListBullet"/>
       </w:pPr>
       <w:r>
-        <w:t>unklare Abgrenzung zwischen bestehendem Anmeldesupport und weitergehendem fachlichen oder technischen Support</w:t>
+        <w:t>die Abgrenzung zwischen bestehendem Anmeldesupport und weitergehendem fachlichen oder technischen Support ist aktuell noch nicht ausreichend geklärt; Supportwege und Zuständigkeiten müssen daher vor dem Rollout verbindlich festgelegt werden</w:t>
       </w:r>
     </w:p>
     <w:p>
@@ -672,7 +672,7 @@
         <w:pStyle w:val="ListBullet"/>
       </w:pPr>
       <w:r>
-        <w:t>Risiko, dass Kommunikation, Befähigung und Support nicht mit derselben Verbindlichkeit vorbereitet werden wie die technische Bereitstellung</w:t>
+        <w:t>es besteht das Risiko, dass Kommunikation, Befähigung und Support nicht mit derselben Verbindlichkeit vorbereitet werden wie die technische Bereitstellung; Kommunikationsmaßnahmen und Rückmeldewege müssen deshalb rechtzeitig terminiert, vorbereitet und ausgewertet werden</w:t>
       </w:r>
     </w:p>
     <w:p/>
@@ -681,48 +681,7 @@
         <w:pStyle w:val="Heading2"/>
       </w:pPr>
       <w:r>
-        <w:t>10. Maßnahmen zur Absicherung</w:t>
-      </w:r>
-    </w:p>
-    <w:p>
-      <w:pPr>
-        <w:pStyle w:val="ListBullet"/>
-      </w:pPr>
-      <w:r>
-        <w:t>offene technische und organisatorische Punkte müssen vor dem Livegang transparent benannt und priorisiert werden</w:t>
-      </w:r>
-    </w:p>
-    <w:p>
-      <w:pPr>
-        <w:pStyle w:val="ListBullet"/>
-      </w:pPr>
-      <w:r>
-        <w:t>Supportwege und Zuständigkeiten müssen vor dem Rollout verbindlich geklärt werden</w:t>
-      </w:r>
-    </w:p>
-    <w:p>
-      <w:pPr>
-        <w:pStyle w:val="ListBullet"/>
-      </w:pPr>
-      <w:r>
-        <w:t>Kommunikationsmaßnahmen müssen rechtzeitig terminiert und vorbereitet werden</w:t>
-      </w:r>
-    </w:p>
-    <w:p>
-      <w:pPr>
-        <w:pStyle w:val="ListBullet"/>
-      </w:pPr>
-      <w:r>
-        <w:t>Rückmeldungen aus der Einführungsphase müssen eng begleitet und systematisch ausgewertet werden</w:t>
-      </w:r>
-    </w:p>
-    <w:p/>
-    <w:p>
-      <w:pPr>
-        <w:pStyle w:val="Heading2"/>
-      </w:pPr>
-      <w:r>
-        <w:t>11. Erfolgskriterien</w:t>
+        <w:t>10. Erfolgskriterien</w:t>
       </w:r>
     </w:p>
     <w:p>
@@ -771,7 +730,7 @@
         <w:pStyle w:val="Heading2"/>
       </w:pPr>
       <w:r>
-        <w:t>12. Offene Punkte und nächste Schritte</w:t>
+        <w:t>11. Offene Punkte und nächste Schritte</w:t>
       </w:r>
     </w:p>
     <w:p>

</xml_diff>